<commit_message>
Add demo video link (youtu.be/vouw0dOcj2k) to submission doc and README
Co-Authored-By: Claude Opus 4.8 <noreply@anthropic.com>
</commit_message>
<xml_diff>
--- a/outputs/nextATTACKs_Submission.docx
+++ b/outputs/nextATTACKs_Submission.docx
@@ -296,6 +296,52 @@
                 <w:sz w:val="17"/>
               </w:rPr>
               <w:t>https://resilience-graph-ai.onrender.com</w:t>
+            </w:r>
+          </w:p>
+        </w:tc>
+      </w:tr>
+      <w:tr>
+        <w:tc>
+          <w:tcPr>
+            <w:tcW w:type="dxa" w:w="2494"/>
+            <w:shd w:val="clear" w:color="auto" w:fill="FFFFFF"/>
+          </w:tcPr>
+          <w:p>
+            <w:pPr>
+              <w:spacing w:after="40" w:before="40" w:line="252" w:lineRule="auto"/>
+            </w:pPr>
+            <w:r/>
+            <w:r>
+              <w:rPr>
+                <w:rFonts w:ascii="Calibri" w:hAnsi="Calibri" w:eastAsia="Calibri"/>
+                <w:b w:val="0"/>
+                <w:i w:val="0"/>
+                <w:color w:val="000000"/>
+                <w:sz w:val="17"/>
+              </w:rPr>
+              <w:t>Demo video (YouTube)</w:t>
+            </w:r>
+          </w:p>
+        </w:tc>
+        <w:tc>
+          <w:tcPr>
+            <w:tcW w:type="dxa" w:w="7143"/>
+            <w:shd w:val="clear" w:color="auto" w:fill="FFFFFF"/>
+          </w:tcPr>
+          <w:p>
+            <w:pPr>
+              <w:spacing w:after="40" w:before="40" w:line="252" w:lineRule="auto"/>
+            </w:pPr>
+            <w:r/>
+            <w:r>
+              <w:rPr>
+                <w:rFonts w:ascii="Calibri" w:hAnsi="Calibri" w:eastAsia="Calibri"/>
+                <w:b w:val="0"/>
+                <w:i w:val="0"/>
+                <w:color w:val="000000"/>
+                <w:sz w:val="17"/>
+              </w:rPr>
+              <w:t>https://youtu.be/vouw0dOcj2k</w:t>
             </w:r>
           </w:p>
         </w:tc>

</xml_diff>